<commit_message>
test(qa): fix testID table, assert History tab selected in deeplink flow, regenerate plan docx
</commit_message>
<xml_diff>
--- a/docs/qa/MacroZone - Strategie et Plan de Test.docx
+++ b/docs/qa/MacroZone - Strategie et Plan de Test.docx
@@ -4297,6 +4297,1694 @@
                 <w:szCs w:val="20"/>
               </w:rPr>
               <w:t xml:space="preserve">P1 (manuel)</w:t>
+            </w:r>
+          </w:p>
+        </w:tc>
+      </w:tr>
+      <w:tr>
+        <w:tc>
+          <w:tcPr>
+            <w:tcW w:type="dxa" w:w="1800"/>
+            <w:tcBorders>
+              <w:top w:val="single" w:color="CCCCCC" w:sz="1"/>
+              <w:left w:val="single" w:color="CCCCCC" w:sz="1"/>
+              <w:bottom w:val="single" w:color="CCCCCC" w:sz="1"/>
+              <w:right w:val="single" w:color="CCCCCC" w:sz="1"/>
+            </w:tcBorders>
+            <w:shd w:fill="FFFFFF" w:val="clear"/>
+            <w:tcMar>
+              <w:top w:type="dxa" w:w="80"/>
+              <w:left w:type="dxa" w:w="120"/>
+              <w:bottom w:type="dxa" w:w="80"/>
+              <w:right w:type="dxa" w:w="120"/>
+            </w:tcMar>
+          </w:tcPr>
+          <w:p>
+            <w:r>
+              <w:rPr>
+                <w:b w:val="false"/>
+                <w:bCs w:val="false"/>
+                <w:sz w:val="20"/>
+                <w:szCs w:val="20"/>
+              </w:rPr>
+              <w:t xml:space="preserve">TC-E2E-09</w:t>
+            </w:r>
+          </w:p>
+        </w:tc>
+        <w:tc>
+          <w:tcPr>
+            <w:tcW w:type="dxa" w:w="5760"/>
+            <w:tcBorders>
+              <w:top w:val="single" w:color="CCCCCC" w:sz="1"/>
+              <w:left w:val="single" w:color="CCCCCC" w:sz="1"/>
+              <w:bottom w:val="single" w:color="CCCCCC" w:sz="1"/>
+              <w:right w:val="single" w:color="CCCCCC" w:sz="1"/>
+            </w:tcBorders>
+            <w:shd w:fill="FFFFFF" w:val="clear"/>
+            <w:tcMar>
+              <w:top w:type="dxa" w:w="80"/>
+              <w:left w:type="dxa" w:w="120"/>
+              <w:bottom w:type="dxa" w:w="80"/>
+              <w:right w:type="dxa" w:w="120"/>
+            </w:tcMar>
+          </w:tcPr>
+          <w:p>
+            <w:r>
+              <w:rPr>
+                <w:b w:val="false"/>
+                <w:bCs w:val="false"/>
+                <w:sz w:val="20"/>
+                <w:szCs w:val="20"/>
+              </w:rPr>
+              <w:t xml:space="preserve">Photo Profile identique à Community</w:t>
+            </w:r>
+          </w:p>
+        </w:tc>
+        <w:tc>
+          <w:tcPr>
+            <w:tcW w:type="dxa" w:w="1800"/>
+            <w:tcBorders>
+              <w:top w:val="single" w:color="CCCCCC" w:sz="1"/>
+              <w:left w:val="single" w:color="CCCCCC" w:sz="1"/>
+              <w:bottom w:val="single" w:color="CCCCCC" w:sz="1"/>
+              <w:right w:val="single" w:color="CCCCCC" w:sz="1"/>
+            </w:tcBorders>
+            <w:shd w:fill="FFFFFF" w:val="clear"/>
+            <w:tcMar>
+              <w:top w:type="dxa" w:w="80"/>
+              <w:left w:type="dxa" w:w="120"/>
+              <w:bottom w:type="dxa" w:w="80"/>
+              <w:right w:type="dxa" w:w="120"/>
+            </w:tcMar>
+          </w:tcPr>
+          <w:p>
+            <w:r>
+              <w:rPr>
+                <w:b w:val="false"/>
+                <w:bCs w:val="false"/>
+                <w:sz w:val="20"/>
+                <w:szCs w:val="20"/>
+              </w:rPr>
+              <w:t xml:space="preserve">P0</w:t>
+            </w:r>
+          </w:p>
+        </w:tc>
+      </w:tr>
+      <w:tr>
+        <w:tc>
+          <w:tcPr>
+            <w:tcW w:type="dxa" w:w="1800"/>
+            <w:tcBorders>
+              <w:top w:val="single" w:color="CCCCCC" w:sz="1"/>
+              <w:left w:val="single" w:color="CCCCCC" w:sz="1"/>
+              <w:bottom w:val="single" w:color="CCCCCC" w:sz="1"/>
+              <w:right w:val="single" w:color="CCCCCC" w:sz="1"/>
+            </w:tcBorders>
+            <w:shd w:fill="FFFFFF" w:val="clear"/>
+            <w:tcMar>
+              <w:top w:type="dxa" w:w="80"/>
+              <w:left w:type="dxa" w:w="120"/>
+              <w:bottom w:type="dxa" w:w="80"/>
+              <w:right w:type="dxa" w:w="120"/>
+            </w:tcMar>
+          </w:tcPr>
+          <w:p>
+            <w:r>
+              <w:rPr>
+                <w:b w:val="false"/>
+                <w:bCs w:val="false"/>
+                <w:sz w:val="20"/>
+                <w:szCs w:val="20"/>
+              </w:rPr>
+              <w:t xml:space="preserve">TC-E2E-10</w:t>
+            </w:r>
+          </w:p>
+        </w:tc>
+        <w:tc>
+          <w:tcPr>
+            <w:tcW w:type="dxa" w:w="5760"/>
+            <w:tcBorders>
+              <w:top w:val="single" w:color="CCCCCC" w:sz="1"/>
+              <w:left w:val="single" w:color="CCCCCC" w:sz="1"/>
+              <w:bottom w:val="single" w:color="CCCCCC" w:sz="1"/>
+              <w:right w:val="single" w:color="CCCCCC" w:sz="1"/>
+            </w:tcBorders>
+            <w:shd w:fill="FFFFFF" w:val="clear"/>
+            <w:tcMar>
+              <w:top w:type="dxa" w:w="80"/>
+              <w:left w:type="dxa" w:w="120"/>
+              <w:bottom w:type="dxa" w:w="80"/>
+              <w:right w:type="dxa" w:w="120"/>
+            </w:tcMar>
+          </w:tcPr>
+          <w:p>
+            <w:r>
+              <w:rPr>
+                <w:b w:val="false"/>
+                <w:bCs w:val="false"/>
+                <w:sz w:val="20"/>
+                <w:szCs w:val="20"/>
+              </w:rPr>
+              <w:t xml:space="preserve">Onglet Historique visible sur Journal + ouvre Tous les repas</w:t>
+            </w:r>
+          </w:p>
+        </w:tc>
+        <w:tc>
+          <w:tcPr>
+            <w:tcW w:type="dxa" w:w="1800"/>
+            <w:tcBorders>
+              <w:top w:val="single" w:color="CCCCCC" w:sz="1"/>
+              <w:left w:val="single" w:color="CCCCCC" w:sz="1"/>
+              <w:bottom w:val="single" w:color="CCCCCC" w:sz="1"/>
+              <w:right w:val="single" w:color="CCCCCC" w:sz="1"/>
+            </w:tcBorders>
+            <w:shd w:fill="FFFFFF" w:val="clear"/>
+            <w:tcMar>
+              <w:top w:type="dxa" w:w="80"/>
+              <w:left w:type="dxa" w:w="120"/>
+              <w:bottom w:type="dxa" w:w="80"/>
+              <w:right w:type="dxa" w:w="120"/>
+            </w:tcMar>
+          </w:tcPr>
+          <w:p>
+            <w:r>
+              <w:rPr>
+                <w:b w:val="false"/>
+                <w:bCs w:val="false"/>
+                <w:sz w:val="20"/>
+                <w:szCs w:val="20"/>
+              </w:rPr>
+              <w:t xml:space="preserve">P0</w:t>
+            </w:r>
+          </w:p>
+        </w:tc>
+      </w:tr>
+      <w:tr>
+        <w:tc>
+          <w:tcPr>
+            <w:tcW w:type="dxa" w:w="1800"/>
+            <w:tcBorders>
+              <w:top w:val="single" w:color="CCCCCC" w:sz="1"/>
+              <w:left w:val="single" w:color="CCCCCC" w:sz="1"/>
+              <w:bottom w:val="single" w:color="CCCCCC" w:sz="1"/>
+              <w:right w:val="single" w:color="CCCCCC" w:sz="1"/>
+            </w:tcBorders>
+            <w:shd w:fill="FFFFFF" w:val="clear"/>
+            <w:tcMar>
+              <w:top w:type="dxa" w:w="80"/>
+              <w:left w:type="dxa" w:w="120"/>
+              <w:bottom w:type="dxa" w:w="80"/>
+              <w:right w:type="dxa" w:w="120"/>
+            </w:tcMar>
+          </w:tcPr>
+          <w:p>
+            <w:r>
+              <w:rPr>
+                <w:b w:val="false"/>
+                <w:bCs w:val="false"/>
+                <w:sz w:val="20"/>
+                <w:szCs w:val="20"/>
+              </w:rPr>
+              <w:t xml:space="preserve">TC-E2E-11</w:t>
+            </w:r>
+          </w:p>
+        </w:tc>
+        <w:tc>
+          <w:tcPr>
+            <w:tcW w:type="dxa" w:w="5760"/>
+            <w:tcBorders>
+              <w:top w:val="single" w:color="CCCCCC" w:sz="1"/>
+              <w:left w:val="single" w:color="CCCCCC" w:sz="1"/>
+              <w:bottom w:val="single" w:color="CCCCCC" w:sz="1"/>
+              <w:right w:val="single" w:color="CCCCCC" w:sz="1"/>
+            </w:tcBorders>
+            <w:shd w:fill="FFFFFF" w:val="clear"/>
+            <w:tcMar>
+              <w:top w:type="dxa" w:w="80"/>
+              <w:left w:type="dxa" w:w="120"/>
+              <w:bottom w:type="dxa" w:w="80"/>
+              <w:right w:type="dxa" w:w="120"/>
+            </w:tcMar>
+          </w:tcPr>
+          <w:p>
+            <w:r>
+              <w:rPr>
+                <w:b w:val="false"/>
+                <w:bCs w:val="false"/>
+                <w:sz w:val="20"/>
+                <w:szCs w:val="20"/>
+              </w:rPr>
+              <w:t xml:space="preserve">Deep link macrozone://meals → Historique sélectionné, Journal non sélectionné</w:t>
+            </w:r>
+          </w:p>
+        </w:tc>
+        <w:tc>
+          <w:tcPr>
+            <w:tcW w:type="dxa" w:w="1800"/>
+            <w:tcBorders>
+              <w:top w:val="single" w:color="CCCCCC" w:sz="1"/>
+              <w:left w:val="single" w:color="CCCCCC" w:sz="1"/>
+              <w:bottom w:val="single" w:color="CCCCCC" w:sz="1"/>
+              <w:right w:val="single" w:color="CCCCCC" w:sz="1"/>
+            </w:tcBorders>
+            <w:shd w:fill="FFFFFF" w:val="clear"/>
+            <w:tcMar>
+              <w:top w:type="dxa" w:w="80"/>
+              <w:left w:type="dxa" w:w="120"/>
+              <w:bottom w:type="dxa" w:w="80"/>
+              <w:right w:type="dxa" w:w="120"/>
+            </w:tcMar>
+          </w:tcPr>
+          <w:p>
+            <w:r>
+              <w:rPr>
+                <w:b w:val="false"/>
+                <w:bCs w:val="false"/>
+                <w:sz w:val="20"/>
+                <w:szCs w:val="20"/>
+              </w:rPr>
+              <w:t xml:space="preserve">P1</w:t>
+            </w:r>
+          </w:p>
+        </w:tc>
+      </w:tr>
+    </w:tbl>
+    <w:p>
+      <w:pPr>
+        <w:pStyle w:val="Heading2"/>
+      </w:pPr>
+      <w:r>
+        <w:t xml:space="preserve">Onglet Historique (TC-NAV-HIST)</w:t>
+      </w:r>
+    </w:p>
+    <w:p>
+      <w:r>
+        <w:t xml:space="preserve">Barre du bas : Journal · Historique · (+) Ajouter · Inspirer · Moi. L'onglet Historique (Ionicons time-outline, clé tabs.allMeals) ouvre « Tous les repas » (route (tabs)/meals).</w:t>
+      </w:r>
+    </w:p>
+    <w:tbl>
+      <w:tblPr>
+        <w:tblW w:type="dxa" w:w="9360"/>
+        <w:tblBorders>
+          <w:top w:val="single" w:color="auto" w:sz="4"/>
+          <w:left w:val="single" w:color="auto" w:sz="4"/>
+          <w:bottom w:val="single" w:color="auto" w:sz="4"/>
+          <w:right w:val="single" w:color="auto" w:sz="4"/>
+          <w:insideH w:val="single" w:color="auto" w:sz="4"/>
+          <w:insideV w:val="single" w:color="auto" w:sz="4"/>
+        </w:tblBorders>
+      </w:tblPr>
+      <w:tblGrid>
+        <w:gridCol w:w="1900"/>
+        <w:gridCol w:w="2700"/>
+        <w:gridCol w:w="3660"/>
+        <w:gridCol w:w="1100"/>
+      </w:tblGrid>
+      <w:tr>
+        <w:tc>
+          <w:tcPr>
+            <w:tcW w:type="dxa" w:w="1900"/>
+            <w:tcBorders>
+              <w:top w:val="single" w:color="CCCCCC" w:sz="1"/>
+              <w:left w:val="single" w:color="CCCCCC" w:sz="1"/>
+              <w:bottom w:val="single" w:color="CCCCCC" w:sz="1"/>
+              <w:right w:val="single" w:color="CCCCCC" w:sz="1"/>
+            </w:tcBorders>
+            <w:shd w:fill="D5E8F0" w:val="clear"/>
+            <w:tcMar>
+              <w:top w:type="dxa" w:w="80"/>
+              <w:left w:type="dxa" w:w="120"/>
+              <w:bottom w:type="dxa" w:w="80"/>
+              <w:right w:type="dxa" w:w="120"/>
+            </w:tcMar>
+          </w:tcPr>
+          <w:p>
+            <w:r>
+              <w:rPr>
+                <w:b/>
+                <w:bCs/>
+                <w:sz w:val="20"/>
+                <w:szCs w:val="20"/>
+              </w:rPr>
+              <w:t xml:space="preserve">ID</w:t>
+            </w:r>
+          </w:p>
+        </w:tc>
+        <w:tc>
+          <w:tcPr>
+            <w:tcW w:type="dxa" w:w="2700"/>
+            <w:tcBorders>
+              <w:top w:val="single" w:color="CCCCCC" w:sz="1"/>
+              <w:left w:val="single" w:color="CCCCCC" w:sz="1"/>
+              <w:bottom w:val="single" w:color="CCCCCC" w:sz="1"/>
+              <w:right w:val="single" w:color="CCCCCC" w:sz="1"/>
+            </w:tcBorders>
+            <w:shd w:fill="D5E8F0" w:val="clear"/>
+            <w:tcMar>
+              <w:top w:type="dxa" w:w="80"/>
+              <w:left w:type="dxa" w:w="120"/>
+              <w:bottom w:type="dxa" w:w="80"/>
+              <w:right w:type="dxa" w:w="120"/>
+            </w:tcMar>
+          </w:tcPr>
+          <w:p>
+            <w:r>
+              <w:rPr>
+                <w:b/>
+                <w:bCs/>
+                <w:sz w:val="20"/>
+                <w:szCs w:val="20"/>
+              </w:rPr>
+              <w:t xml:space="preserve">Scénario</w:t>
+            </w:r>
+          </w:p>
+        </w:tc>
+        <w:tc>
+          <w:tcPr>
+            <w:tcW w:type="dxa" w:w="3660"/>
+            <w:tcBorders>
+              <w:top w:val="single" w:color="CCCCCC" w:sz="1"/>
+              <w:left w:val="single" w:color="CCCCCC" w:sz="1"/>
+              <w:bottom w:val="single" w:color="CCCCCC" w:sz="1"/>
+              <w:right w:val="single" w:color="CCCCCC" w:sz="1"/>
+            </w:tcBorders>
+            <w:shd w:fill="D5E8F0" w:val="clear"/>
+            <w:tcMar>
+              <w:top w:type="dxa" w:w="80"/>
+              <w:left w:type="dxa" w:w="120"/>
+              <w:bottom w:type="dxa" w:w="80"/>
+              <w:right w:type="dxa" w:w="120"/>
+            </w:tcMar>
+          </w:tcPr>
+          <w:p>
+            <w:r>
+              <w:rPr>
+                <w:b/>
+                <w:bCs/>
+                <w:sz w:val="20"/>
+                <w:szCs w:val="20"/>
+              </w:rPr>
+              <w:t xml:space="preserve">Résultat attendu</w:t>
+            </w:r>
+          </w:p>
+        </w:tc>
+        <w:tc>
+          <w:tcPr>
+            <w:tcW w:type="dxa" w:w="1100"/>
+            <w:tcBorders>
+              <w:top w:val="single" w:color="CCCCCC" w:sz="1"/>
+              <w:left w:val="single" w:color="CCCCCC" w:sz="1"/>
+              <w:bottom w:val="single" w:color="CCCCCC" w:sz="1"/>
+              <w:right w:val="single" w:color="CCCCCC" w:sz="1"/>
+            </w:tcBorders>
+            <w:shd w:fill="D5E8F0" w:val="clear"/>
+            <w:tcMar>
+              <w:top w:type="dxa" w:w="80"/>
+              <w:left w:type="dxa" w:w="120"/>
+              <w:bottom w:type="dxa" w:w="80"/>
+              <w:right w:type="dxa" w:w="120"/>
+            </w:tcMar>
+          </w:tcPr>
+          <w:p>
+            <w:r>
+              <w:rPr>
+                <w:b/>
+                <w:bCs/>
+                <w:sz w:val="20"/>
+                <w:szCs w:val="20"/>
+              </w:rPr>
+              <w:t xml:space="preserve">Priorité</w:t>
+            </w:r>
+          </w:p>
+        </w:tc>
+      </w:tr>
+      <w:tr>
+        <w:tc>
+          <w:tcPr>
+            <w:tcW w:type="dxa" w:w="1900"/>
+            <w:tcBorders>
+              <w:top w:val="single" w:color="CCCCCC" w:sz="1"/>
+              <w:left w:val="single" w:color="CCCCCC" w:sz="1"/>
+              <w:bottom w:val="single" w:color="CCCCCC" w:sz="1"/>
+              <w:right w:val="single" w:color="CCCCCC" w:sz="1"/>
+            </w:tcBorders>
+            <w:shd w:fill="FFFFFF" w:val="clear"/>
+            <w:tcMar>
+              <w:top w:type="dxa" w:w="80"/>
+              <w:left w:type="dxa" w:w="120"/>
+              <w:bottom w:type="dxa" w:w="80"/>
+              <w:right w:type="dxa" w:w="120"/>
+            </w:tcMar>
+          </w:tcPr>
+          <w:p>
+            <w:r>
+              <w:rPr>
+                <w:b w:val="false"/>
+                <w:bCs w:val="false"/>
+                <w:sz w:val="20"/>
+                <w:szCs w:val="20"/>
+              </w:rPr>
+              <w:t xml:space="preserve">TC-NAV-HIST-01</w:t>
+            </w:r>
+          </w:p>
+        </w:tc>
+        <w:tc>
+          <w:tcPr>
+            <w:tcW w:type="dxa" w:w="2700"/>
+            <w:tcBorders>
+              <w:top w:val="single" w:color="CCCCCC" w:sz="1"/>
+              <w:left w:val="single" w:color="CCCCCC" w:sz="1"/>
+              <w:bottom w:val="single" w:color="CCCCCC" w:sz="1"/>
+              <w:right w:val="single" w:color="CCCCCC" w:sz="1"/>
+            </w:tcBorders>
+            <w:shd w:fill="FFFFFF" w:val="clear"/>
+            <w:tcMar>
+              <w:top w:type="dxa" w:w="80"/>
+              <w:left w:type="dxa" w:w="120"/>
+              <w:bottom w:type="dxa" w:w="80"/>
+              <w:right w:type="dxa" w:w="120"/>
+            </w:tcMar>
+          </w:tcPr>
+          <w:p>
+            <w:r>
+              <w:rPr>
+                <w:b w:val="false"/>
+                <w:bCs w:val="false"/>
+                <w:sz w:val="20"/>
+                <w:szCs w:val="20"/>
+              </w:rPr>
+              <w:t xml:space="preserve">Ordre et sélection des onglets</w:t>
+            </w:r>
+          </w:p>
+        </w:tc>
+        <w:tc>
+          <w:tcPr>
+            <w:tcW w:type="dxa" w:w="3660"/>
+            <w:tcBorders>
+              <w:top w:val="single" w:color="CCCCCC" w:sz="1"/>
+              <w:left w:val="single" w:color="CCCCCC" w:sz="1"/>
+              <w:bottom w:val="single" w:color="CCCCCC" w:sz="1"/>
+              <w:right w:val="single" w:color="CCCCCC" w:sz="1"/>
+            </w:tcBorders>
+            <w:shd w:fill="FFFFFF" w:val="clear"/>
+            <w:tcMar>
+              <w:top w:type="dxa" w:w="80"/>
+              <w:left w:type="dxa" w:w="120"/>
+              <w:bottom w:type="dxa" w:w="80"/>
+              <w:right w:type="dxa" w:w="120"/>
+            </w:tcMar>
+          </w:tcPr>
+          <w:p>
+            <w:r>
+              <w:rPr>
+                <w:b w:val="false"/>
+                <w:bCs w:val="false"/>
+                <w:sz w:val="20"/>
+                <w:szCs w:val="20"/>
+              </w:rPr>
+              <w:t xml:space="preserve">Historique seul sélectionné quand actif, Journal seul sur Journal</w:t>
+            </w:r>
+          </w:p>
+        </w:tc>
+        <w:tc>
+          <w:tcPr>
+            <w:tcW w:type="dxa" w:w="1100"/>
+            <w:tcBorders>
+              <w:top w:val="single" w:color="CCCCCC" w:sz="1"/>
+              <w:left w:val="single" w:color="CCCCCC" w:sz="1"/>
+              <w:bottom w:val="single" w:color="CCCCCC" w:sz="1"/>
+              <w:right w:val="single" w:color="CCCCCC" w:sz="1"/>
+            </w:tcBorders>
+            <w:shd w:fill="FFFFFF" w:val="clear"/>
+            <w:tcMar>
+              <w:top w:type="dxa" w:w="80"/>
+              <w:left w:type="dxa" w:w="120"/>
+              <w:bottom w:type="dxa" w:w="80"/>
+              <w:right w:type="dxa" w:w="120"/>
+            </w:tcMar>
+          </w:tcPr>
+          <w:p>
+            <w:r>
+              <w:rPr>
+                <w:b w:val="false"/>
+                <w:bCs w:val="false"/>
+                <w:sz w:val="20"/>
+                <w:szCs w:val="20"/>
+              </w:rPr>
+              <w:t xml:space="preserve">P0</w:t>
+            </w:r>
+          </w:p>
+        </w:tc>
+      </w:tr>
+      <w:tr>
+        <w:tc>
+          <w:tcPr>
+            <w:tcW w:type="dxa" w:w="1900"/>
+            <w:tcBorders>
+              <w:top w:val="single" w:color="CCCCCC" w:sz="1"/>
+              <w:left w:val="single" w:color="CCCCCC" w:sz="1"/>
+              <w:bottom w:val="single" w:color="CCCCCC" w:sz="1"/>
+              <w:right w:val="single" w:color="CCCCCC" w:sz="1"/>
+            </w:tcBorders>
+            <w:shd w:fill="FFFFFF" w:val="clear"/>
+            <w:tcMar>
+              <w:top w:type="dxa" w:w="80"/>
+              <w:left w:type="dxa" w:w="120"/>
+              <w:bottom w:type="dxa" w:w="80"/>
+              <w:right w:type="dxa" w:w="120"/>
+            </w:tcMar>
+          </w:tcPr>
+          <w:p>
+            <w:r>
+              <w:rPr>
+                <w:b w:val="false"/>
+                <w:bCs w:val="false"/>
+                <w:sz w:val="20"/>
+                <w:szCs w:val="20"/>
+              </w:rPr>
+              <w:t xml:space="preserve">TC-NAV-HIST-02</w:t>
+            </w:r>
+          </w:p>
+        </w:tc>
+        <w:tc>
+          <w:tcPr>
+            <w:tcW w:type="dxa" w:w="2700"/>
+            <w:tcBorders>
+              <w:top w:val="single" w:color="CCCCCC" w:sz="1"/>
+              <w:left w:val="single" w:color="CCCCCC" w:sz="1"/>
+              <w:bottom w:val="single" w:color="CCCCCC" w:sz="1"/>
+              <w:right w:val="single" w:color="CCCCCC" w:sz="1"/>
+            </w:tcBorders>
+            <w:shd w:fill="FFFFFF" w:val="clear"/>
+            <w:tcMar>
+              <w:top w:type="dxa" w:w="80"/>
+              <w:left w:type="dxa" w:w="120"/>
+              <w:bottom w:type="dxa" w:w="80"/>
+              <w:right w:type="dxa" w:w="120"/>
+            </w:tcMar>
+          </w:tcPr>
+          <w:p>
+            <w:r>
+              <w:rPr>
+                <w:b w:val="false"/>
+                <w:bCs w:val="false"/>
+                <w:sz w:val="20"/>
+                <w:szCs w:val="20"/>
+              </w:rPr>
+              <w:t xml:space="preserve">Deep link macrozone://meals</w:t>
+            </w:r>
+          </w:p>
+        </w:tc>
+        <w:tc>
+          <w:tcPr>
+            <w:tcW w:type="dxa" w:w="3660"/>
+            <w:tcBorders>
+              <w:top w:val="single" w:color="CCCCCC" w:sz="1"/>
+              <w:left w:val="single" w:color="CCCCCC" w:sz="1"/>
+              <w:bottom w:val="single" w:color="CCCCCC" w:sz="1"/>
+              <w:right w:val="single" w:color="CCCCCC" w:sz="1"/>
+            </w:tcBorders>
+            <w:shd w:fill="FFFFFF" w:val="clear"/>
+            <w:tcMar>
+              <w:top w:type="dxa" w:w="80"/>
+              <w:left w:type="dxa" w:w="120"/>
+              <w:bottom w:type="dxa" w:w="80"/>
+              <w:right w:type="dxa" w:w="120"/>
+            </w:tcMar>
+          </w:tcPr>
+          <w:p>
+            <w:r>
+              <w:rPr>
+                <w:b w:val="false"/>
+                <w:bCs w:val="false"/>
+                <w:sz w:val="20"/>
+                <w:szCs w:val="20"/>
+              </w:rPr>
+              <w:t xml:space="preserve">Tous les repas ; all-meals-tab selected=true, home-tab selected=false (Maestro)</w:t>
+            </w:r>
+          </w:p>
+        </w:tc>
+        <w:tc>
+          <w:tcPr>
+            <w:tcW w:type="dxa" w:w="1100"/>
+            <w:tcBorders>
+              <w:top w:val="single" w:color="CCCCCC" w:sz="1"/>
+              <w:left w:val="single" w:color="CCCCCC" w:sz="1"/>
+              <w:bottom w:val="single" w:color="CCCCCC" w:sz="1"/>
+              <w:right w:val="single" w:color="CCCCCC" w:sz="1"/>
+            </w:tcBorders>
+            <w:shd w:fill="FFFFFF" w:val="clear"/>
+            <w:tcMar>
+              <w:top w:type="dxa" w:w="80"/>
+              <w:left w:type="dxa" w:w="120"/>
+              <w:bottom w:type="dxa" w:w="80"/>
+              <w:right w:type="dxa" w:w="120"/>
+            </w:tcMar>
+          </w:tcPr>
+          <w:p>
+            <w:r>
+              <w:rPr>
+                <w:b w:val="false"/>
+                <w:bCs w:val="false"/>
+                <w:sz w:val="20"/>
+                <w:szCs w:val="20"/>
+              </w:rPr>
+              <w:t xml:space="preserve">P1</w:t>
+            </w:r>
+          </w:p>
+        </w:tc>
+      </w:tr>
+      <w:tr>
+        <w:tc>
+          <w:tcPr>
+            <w:tcW w:type="dxa" w:w="1900"/>
+            <w:tcBorders>
+              <w:top w:val="single" w:color="CCCCCC" w:sz="1"/>
+              <w:left w:val="single" w:color="CCCCCC" w:sz="1"/>
+              <w:bottom w:val="single" w:color="CCCCCC" w:sz="1"/>
+              <w:right w:val="single" w:color="CCCCCC" w:sz="1"/>
+            </w:tcBorders>
+            <w:shd w:fill="FFFFFF" w:val="clear"/>
+            <w:tcMar>
+              <w:top w:type="dxa" w:w="80"/>
+              <w:left w:type="dxa" w:w="120"/>
+              <w:bottom w:type="dxa" w:w="80"/>
+              <w:right w:type="dxa" w:w="120"/>
+            </w:tcMar>
+          </w:tcPr>
+          <w:p>
+            <w:r>
+              <w:rPr>
+                <w:b w:val="false"/>
+                <w:bCs w:val="false"/>
+                <w:sz w:val="20"/>
+                <w:szCs w:val="20"/>
+              </w:rPr>
+              <w:t xml:space="preserve">TC-NAV-HIST-03</w:t>
+            </w:r>
+          </w:p>
+        </w:tc>
+        <w:tc>
+          <w:tcPr>
+            <w:tcW w:type="dxa" w:w="2700"/>
+            <w:tcBorders>
+              <w:top w:val="single" w:color="CCCCCC" w:sz="1"/>
+              <w:left w:val="single" w:color="CCCCCC" w:sz="1"/>
+              <w:bottom w:val="single" w:color="CCCCCC" w:sz="1"/>
+              <w:right w:val="single" w:color="CCCCCC" w:sz="1"/>
+            </w:tcBorders>
+            <w:shd w:fill="FFFFFF" w:val="clear"/>
+            <w:tcMar>
+              <w:top w:type="dxa" w:w="80"/>
+              <w:left w:type="dxa" w:w="120"/>
+              <w:bottom w:type="dxa" w:w="80"/>
+              <w:right w:type="dxa" w:w="120"/>
+            </w:tcMar>
+          </w:tcPr>
+          <w:p>
+            <w:r>
+              <w:rPr>
+                <w:b w:val="false"/>
+                <w:bCs w:val="false"/>
+                <w:sz w:val="20"/>
+                <w:szCs w:val="20"/>
+              </w:rPr>
+              <w:t xml:space="preserve">Retour Android depuis Historique</w:t>
+            </w:r>
+          </w:p>
+        </w:tc>
+        <w:tc>
+          <w:tcPr>
+            <w:tcW w:type="dxa" w:w="3660"/>
+            <w:tcBorders>
+              <w:top w:val="single" w:color="CCCCCC" w:sz="1"/>
+              <w:left w:val="single" w:color="CCCCCC" w:sz="1"/>
+              <w:bottom w:val="single" w:color="CCCCCC" w:sz="1"/>
+              <w:right w:val="single" w:color="CCCCCC" w:sz="1"/>
+            </w:tcBorders>
+            <w:shd w:fill="FFFFFF" w:val="clear"/>
+            <w:tcMar>
+              <w:top w:type="dxa" w:w="80"/>
+              <w:left w:type="dxa" w:w="120"/>
+              <w:bottom w:type="dxa" w:w="80"/>
+              <w:right w:type="dxa" w:w="120"/>
+            </w:tcMar>
+          </w:tcPr>
+          <w:p>
+            <w:r>
+              <w:rPr>
+                <w:b w:val="false"/>
+                <w:bCs w:val="false"/>
+                <w:sz w:val="20"/>
+                <w:szCs w:val="20"/>
+              </w:rPr>
+              <w:t xml:space="preserve">Retour sur Journal, puis sortie de l'app</w:t>
+            </w:r>
+          </w:p>
+        </w:tc>
+        <w:tc>
+          <w:tcPr>
+            <w:tcW w:type="dxa" w:w="1100"/>
+            <w:tcBorders>
+              <w:top w:val="single" w:color="CCCCCC" w:sz="1"/>
+              <w:left w:val="single" w:color="CCCCCC" w:sz="1"/>
+              <w:bottom w:val="single" w:color="CCCCCC" w:sz="1"/>
+              <w:right w:val="single" w:color="CCCCCC" w:sz="1"/>
+            </w:tcBorders>
+            <w:shd w:fill="FFFFFF" w:val="clear"/>
+            <w:tcMar>
+              <w:top w:type="dxa" w:w="80"/>
+              <w:left w:type="dxa" w:w="120"/>
+              <w:bottom w:type="dxa" w:w="80"/>
+              <w:right w:type="dxa" w:w="120"/>
+            </w:tcMar>
+          </w:tcPr>
+          <w:p>
+            <w:r>
+              <w:rPr>
+                <w:b w:val="false"/>
+                <w:bCs w:val="false"/>
+                <w:sz w:val="20"/>
+                <w:szCs w:val="20"/>
+              </w:rPr>
+              <w:t xml:space="preserve">P1</w:t>
+            </w:r>
+          </w:p>
+        </w:tc>
+      </w:tr>
+      <w:tr>
+        <w:tc>
+          <w:tcPr>
+            <w:tcW w:type="dxa" w:w="1900"/>
+            <w:tcBorders>
+              <w:top w:val="single" w:color="CCCCCC" w:sz="1"/>
+              <w:left w:val="single" w:color="CCCCCC" w:sz="1"/>
+              <w:bottom w:val="single" w:color="CCCCCC" w:sz="1"/>
+              <w:right w:val="single" w:color="CCCCCC" w:sz="1"/>
+            </w:tcBorders>
+            <w:shd w:fill="FFFFFF" w:val="clear"/>
+            <w:tcMar>
+              <w:top w:type="dxa" w:w="80"/>
+              <w:left w:type="dxa" w:w="120"/>
+              <w:bottom w:type="dxa" w:w="80"/>
+              <w:right w:type="dxa" w:w="120"/>
+            </w:tcMar>
+          </w:tcPr>
+          <w:p>
+            <w:r>
+              <w:rPr>
+                <w:b w:val="false"/>
+                <w:bCs w:val="false"/>
+                <w:sz w:val="20"/>
+                <w:szCs w:val="20"/>
+              </w:rPr>
+              <w:t xml:space="preserve">TC-NAV-HIST-04</w:t>
+            </w:r>
+          </w:p>
+        </w:tc>
+        <w:tc>
+          <w:tcPr>
+            <w:tcW w:type="dxa" w:w="2700"/>
+            <w:tcBorders>
+              <w:top w:val="single" w:color="CCCCCC" w:sz="1"/>
+              <w:left w:val="single" w:color="CCCCCC" w:sz="1"/>
+              <w:bottom w:val="single" w:color="CCCCCC" w:sz="1"/>
+              <w:right w:val="single" w:color="CCCCCC" w:sz="1"/>
+            </w:tcBorders>
+            <w:shd w:fill="FFFFFF" w:val="clear"/>
+            <w:tcMar>
+              <w:top w:type="dxa" w:w="80"/>
+              <w:left w:type="dxa" w:w="120"/>
+              <w:bottom w:type="dxa" w:w="80"/>
+              <w:right w:type="dxa" w:w="120"/>
+            </w:tcMar>
+          </w:tcPr>
+          <w:p>
+            <w:r>
+              <w:rPr>
+                <w:b w:val="false"/>
+                <w:bCs w:val="false"/>
+                <w:sz w:val="20"/>
+                <w:szCs w:val="20"/>
+              </w:rPr>
+              <w:t xml:space="preserve">Mode édition entre onglets</w:t>
+            </w:r>
+          </w:p>
+        </w:tc>
+        <w:tc>
+          <w:tcPr>
+            <w:tcW w:type="dxa" w:w="3660"/>
+            <w:tcBorders>
+              <w:top w:val="single" w:color="CCCCCC" w:sz="1"/>
+              <w:left w:val="single" w:color="CCCCCC" w:sz="1"/>
+              <w:bottom w:val="single" w:color="CCCCCC" w:sz="1"/>
+              <w:right w:val="single" w:color="CCCCCC" w:sz="1"/>
+            </w:tcBorders>
+            <w:shd w:fill="FFFFFF" w:val="clear"/>
+            <w:tcMar>
+              <w:top w:type="dxa" w:w="80"/>
+              <w:left w:type="dxa" w:w="120"/>
+              <w:bottom w:type="dxa" w:w="80"/>
+              <w:right w:type="dxa" w:w="120"/>
+            </w:tcMar>
+          </w:tcPr>
+          <w:p>
+            <w:r>
+              <w:rPr>
+                <w:b w:val="false"/>
+                <w:bCs w:val="false"/>
+                <w:sz w:val="20"/>
+                <w:szCs w:val="20"/>
+              </w:rPr>
+              <w:t xml:space="preserve">État conservé (écrans d'onglets montés)</w:t>
+            </w:r>
+          </w:p>
+        </w:tc>
+        <w:tc>
+          <w:tcPr>
+            <w:tcW w:type="dxa" w:w="1100"/>
+            <w:tcBorders>
+              <w:top w:val="single" w:color="CCCCCC" w:sz="1"/>
+              <w:left w:val="single" w:color="CCCCCC" w:sz="1"/>
+              <w:bottom w:val="single" w:color="CCCCCC" w:sz="1"/>
+              <w:right w:val="single" w:color="CCCCCC" w:sz="1"/>
+            </w:tcBorders>
+            <w:shd w:fill="FFFFFF" w:val="clear"/>
+            <w:tcMar>
+              <w:top w:type="dxa" w:w="80"/>
+              <w:left w:type="dxa" w:w="120"/>
+              <w:bottom w:type="dxa" w:w="80"/>
+              <w:right w:type="dxa" w:w="120"/>
+            </w:tcMar>
+          </w:tcPr>
+          <w:p>
+            <w:r>
+              <w:rPr>
+                <w:b w:val="false"/>
+                <w:bCs w:val="false"/>
+                <w:sz w:val="20"/>
+                <w:szCs w:val="20"/>
+              </w:rPr>
+              <w:t xml:space="preserve">P2</w:t>
+            </w:r>
+          </w:p>
+        </w:tc>
+      </w:tr>
+      <w:tr>
+        <w:tc>
+          <w:tcPr>
+            <w:tcW w:type="dxa" w:w="1900"/>
+            <w:tcBorders>
+              <w:top w:val="single" w:color="CCCCCC" w:sz="1"/>
+              <w:left w:val="single" w:color="CCCCCC" w:sz="1"/>
+              <w:bottom w:val="single" w:color="CCCCCC" w:sz="1"/>
+              <w:right w:val="single" w:color="CCCCCC" w:sz="1"/>
+            </w:tcBorders>
+            <w:shd w:fill="FFFFFF" w:val="clear"/>
+            <w:tcMar>
+              <w:top w:type="dxa" w:w="80"/>
+              <w:left w:type="dxa" w:w="120"/>
+              <w:bottom w:type="dxa" w:w="80"/>
+              <w:right w:type="dxa" w:w="120"/>
+            </w:tcMar>
+          </w:tcPr>
+          <w:p>
+            <w:r>
+              <w:rPr>
+                <w:b w:val="false"/>
+                <w:bCs w:val="false"/>
+                <w:sz w:val="20"/>
+                <w:szCs w:val="20"/>
+              </w:rPr>
+              <w:t xml:space="preserve">TC-NAV-HIST-05</w:t>
+            </w:r>
+          </w:p>
+        </w:tc>
+        <w:tc>
+          <w:tcPr>
+            <w:tcW w:type="dxa" w:w="2700"/>
+            <w:tcBorders>
+              <w:top w:val="single" w:color="CCCCCC" w:sz="1"/>
+              <w:left w:val="single" w:color="CCCCCC" w:sz="1"/>
+              <w:bottom w:val="single" w:color="CCCCCC" w:sz="1"/>
+              <w:right w:val="single" w:color="CCCCCC" w:sz="1"/>
+            </w:tcBorders>
+            <w:shd w:fill="FFFFFF" w:val="clear"/>
+            <w:tcMar>
+              <w:top w:type="dxa" w:w="80"/>
+              <w:left w:type="dxa" w:w="120"/>
+              <w:bottom w:type="dxa" w:w="80"/>
+              <w:right w:type="dxa" w:w="120"/>
+            </w:tcMar>
+          </w:tcPr>
+          <w:p>
+            <w:r>
+              <w:rPr>
+                <w:b w:val="false"/>
+                <w:bCs w:val="false"/>
+                <w:sz w:val="20"/>
+                <w:szCs w:val="20"/>
+              </w:rPr>
+              <w:t xml:space="preserve">Liste vide</w:t>
+            </w:r>
+          </w:p>
+        </w:tc>
+        <w:tc>
+          <w:tcPr>
+            <w:tcW w:type="dxa" w:w="3660"/>
+            <w:tcBorders>
+              <w:top w:val="single" w:color="CCCCCC" w:sz="1"/>
+              <w:left w:val="single" w:color="CCCCCC" w:sz="1"/>
+              <w:bottom w:val="single" w:color="CCCCCC" w:sz="1"/>
+              <w:right w:val="single" w:color="CCCCCC" w:sz="1"/>
+            </w:tcBorders>
+            <w:shd w:fill="FFFFFF" w:val="clear"/>
+            <w:tcMar>
+              <w:top w:type="dxa" w:w="80"/>
+              <w:left w:type="dxa" w:w="120"/>
+              <w:bottom w:type="dxa" w:w="80"/>
+              <w:right w:type="dxa" w:w="120"/>
+            </w:tcMar>
+          </w:tcPr>
+          <w:p>
+            <w:r>
+              <w:rPr>
+                <w:b w:val="false"/>
+                <w:bCs w:val="false"/>
+                <w:sz w:val="20"/>
+                <w:szCs w:val="20"/>
+              </w:rPr>
+              <w:t xml:space="preserve">« Aucun repas enregistré. », pas de crash</w:t>
+            </w:r>
+          </w:p>
+        </w:tc>
+        <w:tc>
+          <w:tcPr>
+            <w:tcW w:type="dxa" w:w="1100"/>
+            <w:tcBorders>
+              <w:top w:val="single" w:color="CCCCCC" w:sz="1"/>
+              <w:left w:val="single" w:color="CCCCCC" w:sz="1"/>
+              <w:bottom w:val="single" w:color="CCCCCC" w:sz="1"/>
+              <w:right w:val="single" w:color="CCCCCC" w:sz="1"/>
+            </w:tcBorders>
+            <w:shd w:fill="FFFFFF" w:val="clear"/>
+            <w:tcMar>
+              <w:top w:type="dxa" w:w="80"/>
+              <w:left w:type="dxa" w:w="120"/>
+              <w:bottom w:type="dxa" w:w="80"/>
+              <w:right w:type="dxa" w:w="120"/>
+            </w:tcMar>
+          </w:tcPr>
+          <w:p>
+            <w:r>
+              <w:rPr>
+                <w:b w:val="false"/>
+                <w:bCs w:val="false"/>
+                <w:sz w:val="20"/>
+                <w:szCs w:val="20"/>
+              </w:rPr>
+              <w:t xml:space="preserve">P1</w:t>
+            </w:r>
+          </w:p>
+        </w:tc>
+      </w:tr>
+      <w:tr>
+        <w:tc>
+          <w:tcPr>
+            <w:tcW w:type="dxa" w:w="1900"/>
+            <w:tcBorders>
+              <w:top w:val="single" w:color="CCCCCC" w:sz="1"/>
+              <w:left w:val="single" w:color="CCCCCC" w:sz="1"/>
+              <w:bottom w:val="single" w:color="CCCCCC" w:sz="1"/>
+              <w:right w:val="single" w:color="CCCCCC" w:sz="1"/>
+            </w:tcBorders>
+            <w:shd w:fill="FFFFFF" w:val="clear"/>
+            <w:tcMar>
+              <w:top w:type="dxa" w:w="80"/>
+              <w:left w:type="dxa" w:w="120"/>
+              <w:bottom w:type="dxa" w:w="80"/>
+              <w:right w:type="dxa" w:w="120"/>
+            </w:tcMar>
+          </w:tcPr>
+          <w:p>
+            <w:r>
+              <w:rPr>
+                <w:b w:val="false"/>
+                <w:bCs w:val="false"/>
+                <w:sz w:val="20"/>
+                <w:szCs w:val="20"/>
+              </w:rPr>
+              <w:t xml:space="preserve">TC-NAV-HIST-06</w:t>
+            </w:r>
+          </w:p>
+        </w:tc>
+        <w:tc>
+          <w:tcPr>
+            <w:tcW w:type="dxa" w:w="2700"/>
+            <w:tcBorders>
+              <w:top w:val="single" w:color="CCCCCC" w:sz="1"/>
+              <w:left w:val="single" w:color="CCCCCC" w:sz="1"/>
+              <w:bottom w:val="single" w:color="CCCCCC" w:sz="1"/>
+              <w:right w:val="single" w:color="CCCCCC" w:sz="1"/>
+            </w:tcBorders>
+            <w:shd w:fill="FFFFFF" w:val="clear"/>
+            <w:tcMar>
+              <w:top w:type="dxa" w:w="80"/>
+              <w:left w:type="dxa" w:w="120"/>
+              <w:bottom w:type="dxa" w:w="80"/>
+              <w:right w:type="dxa" w:w="120"/>
+            </w:tcMar>
+          </w:tcPr>
+          <w:p>
+            <w:r>
+              <w:rPr>
+                <w:b w:val="false"/>
+                <w:bCs w:val="false"/>
+                <w:sz w:val="20"/>
+                <w:szCs w:val="20"/>
+              </w:rPr>
+              <w:t xml:space="preserve">Changement d'utilisateur</w:t>
+            </w:r>
+          </w:p>
+        </w:tc>
+        <w:tc>
+          <w:tcPr>
+            <w:tcW w:type="dxa" w:w="3660"/>
+            <w:tcBorders>
+              <w:top w:val="single" w:color="CCCCCC" w:sz="1"/>
+              <w:left w:val="single" w:color="CCCCCC" w:sz="1"/>
+              <w:bottom w:val="single" w:color="CCCCCC" w:sz="1"/>
+              <w:right w:val="single" w:color="CCCCCC" w:sz="1"/>
+            </w:tcBorders>
+            <w:shd w:fill="FFFFFF" w:val="clear"/>
+            <w:tcMar>
+              <w:top w:type="dxa" w:w="80"/>
+              <w:left w:type="dxa" w:w="120"/>
+              <w:bottom w:type="dxa" w:w="80"/>
+              <w:right w:type="dxa" w:w="120"/>
+            </w:tcMar>
+          </w:tcPr>
+          <w:p>
+            <w:r>
+              <w:rPr>
+                <w:b w:val="false"/>
+                <w:bCs w:val="false"/>
+                <w:sz w:val="20"/>
+                <w:szCs w:val="20"/>
+              </w:rPr>
+              <w:t xml:space="preserve">Uniquement les repas de l'utilisateur courant</w:t>
+            </w:r>
+          </w:p>
+        </w:tc>
+        <w:tc>
+          <w:tcPr>
+            <w:tcW w:type="dxa" w:w="1100"/>
+            <w:tcBorders>
+              <w:top w:val="single" w:color="CCCCCC" w:sz="1"/>
+              <w:left w:val="single" w:color="CCCCCC" w:sz="1"/>
+              <w:bottom w:val="single" w:color="CCCCCC" w:sz="1"/>
+              <w:right w:val="single" w:color="CCCCCC" w:sz="1"/>
+            </w:tcBorders>
+            <w:shd w:fill="FFFFFF" w:val="clear"/>
+            <w:tcMar>
+              <w:top w:type="dxa" w:w="80"/>
+              <w:left w:type="dxa" w:w="120"/>
+              <w:bottom w:type="dxa" w:w="80"/>
+              <w:right w:type="dxa" w:w="120"/>
+            </w:tcMar>
+          </w:tcPr>
+          <w:p>
+            <w:r>
+              <w:rPr>
+                <w:b w:val="false"/>
+                <w:bCs w:val="false"/>
+                <w:sz w:val="20"/>
+                <w:szCs w:val="20"/>
+              </w:rPr>
+              <w:t xml:space="preserve">P0</w:t>
+            </w:r>
+          </w:p>
+        </w:tc>
+      </w:tr>
+      <w:tr>
+        <w:tc>
+          <w:tcPr>
+            <w:tcW w:type="dxa" w:w="1900"/>
+            <w:tcBorders>
+              <w:top w:val="single" w:color="CCCCCC" w:sz="1"/>
+              <w:left w:val="single" w:color="CCCCCC" w:sz="1"/>
+              <w:bottom w:val="single" w:color="CCCCCC" w:sz="1"/>
+              <w:right w:val="single" w:color="CCCCCC" w:sz="1"/>
+            </w:tcBorders>
+            <w:shd w:fill="FFFFFF" w:val="clear"/>
+            <w:tcMar>
+              <w:top w:type="dxa" w:w="80"/>
+              <w:left w:type="dxa" w:w="120"/>
+              <w:bottom w:type="dxa" w:w="80"/>
+              <w:right w:type="dxa" w:w="120"/>
+            </w:tcMar>
+          </w:tcPr>
+          <w:p>
+            <w:r>
+              <w:rPr>
+                <w:b w:val="false"/>
+                <w:bCs w:val="false"/>
+                <w:sz w:val="20"/>
+                <w:szCs w:val="20"/>
+              </w:rPr>
+              <w:t xml:space="preserve">TC-NAV-HIST-07</w:t>
+            </w:r>
+          </w:p>
+        </w:tc>
+        <w:tc>
+          <w:tcPr>
+            <w:tcW w:type="dxa" w:w="2700"/>
+            <w:tcBorders>
+              <w:top w:val="single" w:color="CCCCCC" w:sz="1"/>
+              <w:left w:val="single" w:color="CCCCCC" w:sz="1"/>
+              <w:bottom w:val="single" w:color="CCCCCC" w:sz="1"/>
+              <w:right w:val="single" w:color="CCCCCC" w:sz="1"/>
+            </w:tcBorders>
+            <w:shd w:fill="FFFFFF" w:val="clear"/>
+            <w:tcMar>
+              <w:top w:type="dxa" w:w="80"/>
+              <w:left w:type="dxa" w:w="120"/>
+              <w:bottom w:type="dxa" w:w="80"/>
+              <w:right w:type="dxa" w:w="120"/>
+            </w:tcMar>
+          </w:tcPr>
+          <w:p>
+            <w:r>
+              <w:rPr>
+                <w:b w:val="false"/>
+                <w:bCs w:val="false"/>
+                <w:sz w:val="20"/>
+                <w:szCs w:val="20"/>
+              </w:rPr>
+              <w:t xml:space="preserve">Grande police / 320 dp (exploratoire)</w:t>
+            </w:r>
+          </w:p>
+        </w:tc>
+        <w:tc>
+          <w:tcPr>
+            <w:tcW w:type="dxa" w:w="3660"/>
+            <w:tcBorders>
+              <w:top w:val="single" w:color="CCCCCC" w:sz="1"/>
+              <w:left w:val="single" w:color="CCCCCC" w:sz="1"/>
+              <w:bottom w:val="single" w:color="CCCCCC" w:sz="1"/>
+              <w:right w:val="single" w:color="CCCCCC" w:sz="1"/>
+            </w:tcBorders>
+            <w:shd w:fill="FFFFFF" w:val="clear"/>
+            <w:tcMar>
+              <w:top w:type="dxa" w:w="80"/>
+              <w:left w:type="dxa" w:w="120"/>
+              <w:bottom w:type="dxa" w:w="80"/>
+              <w:right w:type="dxa" w:w="120"/>
+            </w:tcMar>
+          </w:tcPr>
+          <w:p>
+            <w:r>
+              <w:rPr>
+                <w:b w:val="false"/>
+                <w:bCs w:val="false"/>
+                <w:sz w:val="20"/>
+                <w:szCs w:val="20"/>
+              </w:rPr>
+              <w:t xml:space="preserve">Libellés lisibles ou tronqués proprement, (+) non chevauché</w:t>
+            </w:r>
+          </w:p>
+        </w:tc>
+        <w:tc>
+          <w:tcPr>
+            <w:tcW w:type="dxa" w:w="1100"/>
+            <w:tcBorders>
+              <w:top w:val="single" w:color="CCCCCC" w:sz="1"/>
+              <w:left w:val="single" w:color="CCCCCC" w:sz="1"/>
+              <w:bottom w:val="single" w:color="CCCCCC" w:sz="1"/>
+              <w:right w:val="single" w:color="CCCCCC" w:sz="1"/>
+            </w:tcBorders>
+            <w:shd w:fill="FFFFFF" w:val="clear"/>
+            <w:tcMar>
+              <w:top w:type="dxa" w:w="80"/>
+              <w:left w:type="dxa" w:w="120"/>
+              <w:bottom w:type="dxa" w:w="80"/>
+              <w:right w:type="dxa" w:w="120"/>
+            </w:tcMar>
+          </w:tcPr>
+          <w:p>
+            <w:r>
+              <w:rPr>
+                <w:b w:val="false"/>
+                <w:bCs w:val="false"/>
+                <w:sz w:val="20"/>
+                <w:szCs w:val="20"/>
+              </w:rPr>
+              <w:t xml:space="preserve">P2</w:t>
+            </w:r>
+          </w:p>
+        </w:tc>
+      </w:tr>
+    </w:tbl>
+    <w:p>
+      <w:pPr>
+        <w:pStyle w:val="Heading2"/>
+      </w:pPr>
+      <w:r>
+        <w:t xml:space="preserve">testID de navigation (vérifiés dans le code)</w:t>
+      </w:r>
+    </w:p>
+    <w:tbl>
+      <w:tblPr>
+        <w:tblW w:type="dxa" w:w="9360"/>
+        <w:tblBorders>
+          <w:top w:val="single" w:color="auto" w:sz="4"/>
+          <w:left w:val="single" w:color="auto" w:sz="4"/>
+          <w:bottom w:val="single" w:color="auto" w:sz="4"/>
+          <w:right w:val="single" w:color="auto" w:sz="4"/>
+          <w:insideH w:val="single" w:color="auto" w:sz="4"/>
+          <w:insideV w:val="single" w:color="auto" w:sz="4"/>
+        </w:tblBorders>
+      </w:tblPr>
+      <w:tblGrid>
+        <w:gridCol w:w="5600"/>
+        <w:gridCol w:w="3760"/>
+      </w:tblGrid>
+      <w:tr>
+        <w:tc>
+          <w:tcPr>
+            <w:tcW w:type="dxa" w:w="5600"/>
+            <w:tcBorders>
+              <w:top w:val="single" w:color="CCCCCC" w:sz="1"/>
+              <w:left w:val="single" w:color="CCCCCC" w:sz="1"/>
+              <w:bottom w:val="single" w:color="CCCCCC" w:sz="1"/>
+              <w:right w:val="single" w:color="CCCCCC" w:sz="1"/>
+            </w:tcBorders>
+            <w:shd w:fill="D5E8F0" w:val="clear"/>
+            <w:tcMar>
+              <w:top w:type="dxa" w:w="80"/>
+              <w:left w:type="dxa" w:w="120"/>
+              <w:bottom w:type="dxa" w:w="80"/>
+              <w:right w:type="dxa" w:w="120"/>
+            </w:tcMar>
+          </w:tcPr>
+          <w:p>
+            <w:r>
+              <w:rPr>
+                <w:b/>
+                <w:bCs/>
+                <w:sz w:val="20"/>
+                <w:szCs w:val="20"/>
+              </w:rPr>
+              <w:t xml:space="preserve">Élément</w:t>
+            </w:r>
+          </w:p>
+        </w:tc>
+        <w:tc>
+          <w:tcPr>
+            <w:tcW w:type="dxa" w:w="3760"/>
+            <w:tcBorders>
+              <w:top w:val="single" w:color="CCCCCC" w:sz="1"/>
+              <w:left w:val="single" w:color="CCCCCC" w:sz="1"/>
+              <w:bottom w:val="single" w:color="CCCCCC" w:sz="1"/>
+              <w:right w:val="single" w:color="CCCCCC" w:sz="1"/>
+            </w:tcBorders>
+            <w:shd w:fill="D5E8F0" w:val="clear"/>
+            <w:tcMar>
+              <w:top w:type="dxa" w:w="80"/>
+              <w:left w:type="dxa" w:w="120"/>
+              <w:bottom w:type="dxa" w:w="80"/>
+              <w:right w:type="dxa" w:w="120"/>
+            </w:tcMar>
+          </w:tcPr>
+          <w:p>
+            <w:r>
+              <w:rPr>
+                <w:b/>
+                <w:bCs/>
+                <w:sz w:val="20"/>
+                <w:szCs w:val="20"/>
+              </w:rPr>
+              <w:t xml:space="preserve">testID</w:t>
+            </w:r>
+          </w:p>
+        </w:tc>
+      </w:tr>
+      <w:tr>
+        <w:tc>
+          <w:tcPr>
+            <w:tcW w:type="dxa" w:w="5600"/>
+            <w:tcBorders>
+              <w:top w:val="single" w:color="CCCCCC" w:sz="1"/>
+              <w:left w:val="single" w:color="CCCCCC" w:sz="1"/>
+              <w:bottom w:val="single" w:color="CCCCCC" w:sz="1"/>
+              <w:right w:val="single" w:color="CCCCCC" w:sz="1"/>
+            </w:tcBorders>
+            <w:shd w:fill="FFFFFF" w:val="clear"/>
+            <w:tcMar>
+              <w:top w:type="dxa" w:w="80"/>
+              <w:left w:type="dxa" w:w="120"/>
+              <w:bottom w:type="dxa" w:w="80"/>
+              <w:right w:type="dxa" w:w="120"/>
+            </w:tcMar>
+          </w:tcPr>
+          <w:p>
+            <w:r>
+              <w:rPr>
+                <w:b w:val="false"/>
+                <w:bCs w:val="false"/>
+                <w:sz w:val="20"/>
+                <w:szCs w:val="20"/>
+              </w:rPr>
+              <w:t xml:space="preserve">Onglet Journal</w:t>
+            </w:r>
+          </w:p>
+        </w:tc>
+        <w:tc>
+          <w:tcPr>
+            <w:tcW w:type="dxa" w:w="3760"/>
+            <w:tcBorders>
+              <w:top w:val="single" w:color="CCCCCC" w:sz="1"/>
+              <w:left w:val="single" w:color="CCCCCC" w:sz="1"/>
+              <w:bottom w:val="single" w:color="CCCCCC" w:sz="1"/>
+              <w:right w:val="single" w:color="CCCCCC" w:sz="1"/>
+            </w:tcBorders>
+            <w:shd w:fill="FFFFFF" w:val="clear"/>
+            <w:tcMar>
+              <w:top w:type="dxa" w:w="80"/>
+              <w:left w:type="dxa" w:w="120"/>
+              <w:bottom w:type="dxa" w:w="80"/>
+              <w:right w:type="dxa" w:w="120"/>
+            </w:tcMar>
+          </w:tcPr>
+          <w:p>
+            <w:r>
+              <w:rPr>
+                <w:b w:val="false"/>
+                <w:bCs w:val="false"/>
+                <w:sz w:val="20"/>
+                <w:szCs w:val="20"/>
+              </w:rPr>
+              <w:t xml:space="preserve">home-tab</w:t>
+            </w:r>
+          </w:p>
+        </w:tc>
+      </w:tr>
+      <w:tr>
+        <w:tc>
+          <w:tcPr>
+            <w:tcW w:type="dxa" w:w="5600"/>
+            <w:tcBorders>
+              <w:top w:val="single" w:color="CCCCCC" w:sz="1"/>
+              <w:left w:val="single" w:color="CCCCCC" w:sz="1"/>
+              <w:bottom w:val="single" w:color="CCCCCC" w:sz="1"/>
+              <w:right w:val="single" w:color="CCCCCC" w:sz="1"/>
+            </w:tcBorders>
+            <w:shd w:fill="FFFFFF" w:val="clear"/>
+            <w:tcMar>
+              <w:top w:type="dxa" w:w="80"/>
+              <w:left w:type="dxa" w:w="120"/>
+              <w:bottom w:type="dxa" w:w="80"/>
+              <w:right w:type="dxa" w:w="120"/>
+            </w:tcMar>
+          </w:tcPr>
+          <w:p>
+            <w:r>
+              <w:rPr>
+                <w:b w:val="false"/>
+                <w:bCs w:val="false"/>
+                <w:sz w:val="20"/>
+                <w:szCs w:val="20"/>
+              </w:rPr>
+              <w:t xml:space="preserve">Onglet Historique</w:t>
+            </w:r>
+          </w:p>
+        </w:tc>
+        <w:tc>
+          <w:tcPr>
+            <w:tcW w:type="dxa" w:w="3760"/>
+            <w:tcBorders>
+              <w:top w:val="single" w:color="CCCCCC" w:sz="1"/>
+              <w:left w:val="single" w:color="CCCCCC" w:sz="1"/>
+              <w:bottom w:val="single" w:color="CCCCCC" w:sz="1"/>
+              <w:right w:val="single" w:color="CCCCCC" w:sz="1"/>
+            </w:tcBorders>
+            <w:shd w:fill="FFFFFF" w:val="clear"/>
+            <w:tcMar>
+              <w:top w:type="dxa" w:w="80"/>
+              <w:left w:type="dxa" w:w="120"/>
+              <w:bottom w:type="dxa" w:w="80"/>
+              <w:right w:type="dxa" w:w="120"/>
+            </w:tcMar>
+          </w:tcPr>
+          <w:p>
+            <w:r>
+              <w:rPr>
+                <w:b w:val="false"/>
+                <w:bCs w:val="false"/>
+                <w:sz w:val="20"/>
+                <w:szCs w:val="20"/>
+              </w:rPr>
+              <w:t xml:space="preserve">all-meals-tab</w:t>
+            </w:r>
+          </w:p>
+        </w:tc>
+      </w:tr>
+      <w:tr>
+        <w:tc>
+          <w:tcPr>
+            <w:tcW w:type="dxa" w:w="5600"/>
+            <w:tcBorders>
+              <w:top w:val="single" w:color="CCCCCC" w:sz="1"/>
+              <w:left w:val="single" w:color="CCCCCC" w:sz="1"/>
+              <w:bottom w:val="single" w:color="CCCCCC" w:sz="1"/>
+              <w:right w:val="single" w:color="CCCCCC" w:sz="1"/>
+            </w:tcBorders>
+            <w:shd w:fill="FFFFFF" w:val="clear"/>
+            <w:tcMar>
+              <w:top w:type="dxa" w:w="80"/>
+              <w:left w:type="dxa" w:w="120"/>
+              <w:bottom w:type="dxa" w:w="80"/>
+              <w:right w:type="dxa" w:w="120"/>
+            </w:tcMar>
+          </w:tcPr>
+          <w:p>
+            <w:r>
+              <w:rPr>
+                <w:b w:val="false"/>
+                <w:bCs w:val="false"/>
+                <w:sz w:val="20"/>
+                <w:szCs w:val="20"/>
+              </w:rPr>
+              <w:t xml:space="preserve">Bouton central (+) Ajouter</w:t>
+            </w:r>
+          </w:p>
+        </w:tc>
+        <w:tc>
+          <w:tcPr>
+            <w:tcW w:type="dxa" w:w="3760"/>
+            <w:tcBorders>
+              <w:top w:val="single" w:color="CCCCCC" w:sz="1"/>
+              <w:left w:val="single" w:color="CCCCCC" w:sz="1"/>
+              <w:bottom w:val="single" w:color="CCCCCC" w:sz="1"/>
+              <w:right w:val="single" w:color="CCCCCC" w:sz="1"/>
+            </w:tcBorders>
+            <w:shd w:fill="FFFFFF" w:val="clear"/>
+            <w:tcMar>
+              <w:top w:type="dxa" w:w="80"/>
+              <w:left w:type="dxa" w:w="120"/>
+              <w:bottom w:type="dxa" w:w="80"/>
+              <w:right w:type="dxa" w:w="120"/>
+            </w:tcMar>
+          </w:tcPr>
+          <w:p>
+            <w:r>
+              <w:rPr>
+                <w:b w:val="false"/>
+                <w:bCs w:val="false"/>
+                <w:sz w:val="20"/>
+                <w:szCs w:val="20"/>
+              </w:rPr>
+              <w:t xml:space="preserve">add-meals-tab</w:t>
+            </w:r>
+          </w:p>
+        </w:tc>
+      </w:tr>
+      <w:tr>
+        <w:tc>
+          <w:tcPr>
+            <w:tcW w:type="dxa" w:w="5600"/>
+            <w:tcBorders>
+              <w:top w:val="single" w:color="CCCCCC" w:sz="1"/>
+              <w:left w:val="single" w:color="CCCCCC" w:sz="1"/>
+              <w:bottom w:val="single" w:color="CCCCCC" w:sz="1"/>
+              <w:right w:val="single" w:color="CCCCCC" w:sz="1"/>
+            </w:tcBorders>
+            <w:shd w:fill="FFFFFF" w:val="clear"/>
+            <w:tcMar>
+              <w:top w:type="dxa" w:w="80"/>
+              <w:left w:type="dxa" w:w="120"/>
+              <w:bottom w:type="dxa" w:w="80"/>
+              <w:right w:type="dxa" w:w="120"/>
+            </w:tcMar>
+          </w:tcPr>
+          <w:p>
+            <w:r>
+              <w:rPr>
+                <w:b w:val="false"/>
+                <w:bCs w:val="false"/>
+                <w:sz w:val="20"/>
+                <w:szCs w:val="20"/>
+              </w:rPr>
+              <w:t xml:space="preserve">Onglet Inspirer</w:t>
+            </w:r>
+          </w:p>
+        </w:tc>
+        <w:tc>
+          <w:tcPr>
+            <w:tcW w:type="dxa" w:w="3760"/>
+            <w:tcBorders>
+              <w:top w:val="single" w:color="CCCCCC" w:sz="1"/>
+              <w:left w:val="single" w:color="CCCCCC" w:sz="1"/>
+              <w:bottom w:val="single" w:color="CCCCCC" w:sz="1"/>
+              <w:right w:val="single" w:color="CCCCCC" w:sz="1"/>
+            </w:tcBorders>
+            <w:shd w:fill="FFFFFF" w:val="clear"/>
+            <w:tcMar>
+              <w:top w:type="dxa" w:w="80"/>
+              <w:left w:type="dxa" w:w="120"/>
+              <w:bottom w:type="dxa" w:w="80"/>
+              <w:right w:type="dxa" w:w="120"/>
+            </w:tcMar>
+          </w:tcPr>
+          <w:p>
+            <w:r>
+              <w:rPr>
+                <w:b w:val="false"/>
+                <w:bCs w:val="false"/>
+                <w:sz w:val="20"/>
+                <w:szCs w:val="20"/>
+              </w:rPr>
+              <w:t xml:space="preserve">community-tab</w:t>
+            </w:r>
+          </w:p>
+        </w:tc>
+      </w:tr>
+      <w:tr>
+        <w:tc>
+          <w:tcPr>
+            <w:tcW w:type="dxa" w:w="5600"/>
+            <w:tcBorders>
+              <w:top w:val="single" w:color="CCCCCC" w:sz="1"/>
+              <w:left w:val="single" w:color="CCCCCC" w:sz="1"/>
+              <w:bottom w:val="single" w:color="CCCCCC" w:sz="1"/>
+              <w:right w:val="single" w:color="CCCCCC" w:sz="1"/>
+            </w:tcBorders>
+            <w:shd w:fill="FFFFFF" w:val="clear"/>
+            <w:tcMar>
+              <w:top w:type="dxa" w:w="80"/>
+              <w:left w:type="dxa" w:w="120"/>
+              <w:bottom w:type="dxa" w:w="80"/>
+              <w:right w:type="dxa" w:w="120"/>
+            </w:tcMar>
+          </w:tcPr>
+          <w:p>
+            <w:r>
+              <w:rPr>
+                <w:b w:val="false"/>
+                <w:bCs w:val="false"/>
+                <w:sz w:val="20"/>
+                <w:szCs w:val="20"/>
+              </w:rPr>
+              <w:t xml:space="preserve">Onglet Moi (Paramètres via open-settings-btn)</w:t>
+            </w:r>
+          </w:p>
+        </w:tc>
+        <w:tc>
+          <w:tcPr>
+            <w:tcW w:type="dxa" w:w="3760"/>
+            <w:tcBorders>
+              <w:top w:val="single" w:color="CCCCCC" w:sz="1"/>
+              <w:left w:val="single" w:color="CCCCCC" w:sz="1"/>
+              <w:bottom w:val="single" w:color="CCCCCC" w:sz="1"/>
+              <w:right w:val="single" w:color="CCCCCC" w:sz="1"/>
+            </w:tcBorders>
+            <w:shd w:fill="FFFFFF" w:val="clear"/>
+            <w:tcMar>
+              <w:top w:type="dxa" w:w="80"/>
+              <w:left w:type="dxa" w:w="120"/>
+              <w:bottom w:type="dxa" w:w="80"/>
+              <w:right w:type="dxa" w:w="120"/>
+            </w:tcMar>
+          </w:tcPr>
+          <w:p>
+            <w:r>
+              <w:rPr>
+                <w:b w:val="false"/>
+                <w:bCs w:val="false"/>
+                <w:sz w:val="20"/>
+                <w:szCs w:val="20"/>
+              </w:rPr>
+              <w:t xml:space="preserve">profile-tab</w:t>
+            </w:r>
+          </w:p>
+        </w:tc>
+      </w:tr>
+      <w:tr>
+        <w:tc>
+          <w:tcPr>
+            <w:tcW w:type="dxa" w:w="5600"/>
+            <w:tcBorders>
+              <w:top w:val="single" w:color="CCCCCC" w:sz="1"/>
+              <w:left w:val="single" w:color="CCCCCC" w:sz="1"/>
+              <w:bottom w:val="single" w:color="CCCCCC" w:sz="1"/>
+              <w:right w:val="single" w:color="CCCCCC" w:sz="1"/>
+            </w:tcBorders>
+            <w:shd w:fill="FFFFFF" w:val="clear"/>
+            <w:tcMar>
+              <w:top w:type="dxa" w:w="80"/>
+              <w:left w:type="dxa" w:w="120"/>
+              <w:bottom w:type="dxa" w:w="80"/>
+              <w:right w:type="dxa" w:w="120"/>
+            </w:tcMar>
+          </w:tcPr>
+          <w:p>
+            <w:r>
+              <w:rPr>
+                <w:b w:val="false"/>
+                <w:bCs w:val="false"/>
+                <w:sz w:val="20"/>
+                <w:szCs w:val="20"/>
+              </w:rPr>
+              <w:t xml:space="preserve">Chip « Historique » (écran Journal)</w:t>
+            </w:r>
+          </w:p>
+        </w:tc>
+        <w:tc>
+          <w:tcPr>
+            <w:tcW w:type="dxa" w:w="3760"/>
+            <w:tcBorders>
+              <w:top w:val="single" w:color="CCCCCC" w:sz="1"/>
+              <w:left w:val="single" w:color="CCCCCC" w:sz="1"/>
+              <w:bottom w:val="single" w:color="CCCCCC" w:sz="1"/>
+              <w:right w:val="single" w:color="CCCCCC" w:sz="1"/>
+            </w:tcBorders>
+            <w:shd w:fill="FFFFFF" w:val="clear"/>
+            <w:tcMar>
+              <w:top w:type="dxa" w:w="80"/>
+              <w:left w:type="dxa" w:w="120"/>
+              <w:bottom w:type="dxa" w:w="80"/>
+              <w:right w:type="dxa" w:w="120"/>
+            </w:tcMar>
+          </w:tcPr>
+          <w:p>
+            <w:r>
+              <w:rPr>
+                <w:b w:val="false"/>
+                <w:bCs w:val="false"/>
+                <w:sz w:val="20"/>
+                <w:szCs w:val="20"/>
+              </w:rPr>
+              <w:t xml:space="preserve">journal-history-btn</w:t>
             </w:r>
           </w:p>
         </w:tc>

</xml_diff>